<commit_message>
Complete LAB5 pfSense firewall configuration and report
</commit_message>
<xml_diff>
--- a/LAB5/11_ĐH_THMT-LAB4_1150080027-Phạm_Công_Nguyên.docx
+++ b/LAB5/11_ĐH_THMT-LAB4_1150080027-Phạm_Công_Nguyên.docx
@@ -3,43 +3,131 @@
 <w:document xmlns:wpc="http://schemas.microsoft.com/office/word/2010/wordprocessingCanvas" xmlns:cx="http://schemas.microsoft.com/office/drawing/2014/chartex" xmlns:cx1="http://schemas.microsoft.com/office/drawing/2015/9/8/chartex" xmlns:cx2="http://schemas.microsoft.com/office/drawing/2015/10/21/chartex" xmlns:cx3="http://schemas.microsoft.com/office/drawing/2016/5/9/chartex" xmlns:cx4="http://schemas.microsoft.com/office/drawing/2016/5/10/chartex" xmlns:cx5="http://schemas.microsoft.com/office/drawing/2016/5/11/chartex" xmlns:cx6="http://schemas.microsoft.com/office/drawing/2016/5/12/chartex" xmlns:cx7="http://schemas.microsoft.com/office/drawing/2016/5/13/chartex" xmlns:cx8="http://schemas.microsoft.com/office/drawing/2016/5/14/chartex" xmlns:mc="http://schemas.openxmlformats.org/markup-compatibility/2006" xmlns:aink="http://schemas.microsoft.com/office/drawing/2016/ink" xmlns:am3d="http://schemas.microsoft.com/office/drawing/2017/model3d" xmlns:o="urn:schemas-microsoft-com:office:office" xmlns:oel="http://schemas.microsoft.com/office/2019/extlst" xmlns:r="http://schemas.openxmlformats.org/officeDocument/2006/relationships" xmlns:m="http://schemas.openxmlformats.org/officeDocument/2006/math" xmlns:v="urn:schemas-microsoft-com:vml" xmlns:wp14="http://schemas.microsoft.com/office/word/2010/wordprocessingDrawing" xmlns:wp="http://schemas.openxmlformats.org/drawingml/2006/wordprocessingDrawing" xmlns:w10="urn:schemas-microsoft-com:office:word" xmlns:w="http://schemas.openxmlformats.org/wordprocessingml/2006/main" xmlns:w14="http://schemas.microsoft.com/office/word/2010/wordml" xmlns:w15="http://schemas.microsoft.com/office/word/2012/wordml" xmlns:w16cex="http://schemas.microsoft.com/office/word/2018/wordml/cex" xmlns:w16cid="http://schemas.microsoft.com/office/word/2016/wordml/cid" xmlns:w16="http://schemas.microsoft.com/office/word/2018/wordml" xmlns:w16du="http://schemas.microsoft.com/office/word/2023/wordml/word16du" xmlns:w16sdtdh="http://schemas.microsoft.com/office/word/2020/wordml/sdtdatahash" xmlns:w16sdtfl="http://schemas.microsoft.com/office/word/2024/wordml/sdtformatlock" xmlns:w16se="http://schemas.microsoft.com/office/word/2015/wordml/symex" xmlns:wpg="http://schemas.microsoft.com/office/word/2010/wordprocessingGroup" xmlns:wpi="http://schemas.microsoft.com/office/word/2010/wordprocessingInk" xmlns:wne="http://schemas.microsoft.com/office/word/2006/wordml" xmlns:wps="http://schemas.microsoft.com/office/word/2010/wordprocessingShape" mc:Ignorable="w14 w15 w16se w16cid w16 w16cex w16sdtdh w16sdtfl w16du wp14">
   <w:body>
     <w:p>
+      <w:pPr>
+        <w:rPr>
+          <w:rFonts w:ascii="Times New Roman" w:hAnsi="Times New Roman" w:cs="Times New Roman"/>
+          <w:sz w:val="26"/>
+          <w:szCs w:val="26"/>
+        </w:rPr>
+      </w:pPr>
       <w:proofErr w:type="spellStart"/>
       <w:r>
+        <w:rPr>
+          <w:rFonts w:ascii="Times New Roman" w:hAnsi="Times New Roman" w:cs="Times New Roman"/>
+          <w:sz w:val="26"/>
+          <w:szCs w:val="26"/>
+        </w:rPr>
         <w:t>Tên</w:t>
       </w:r>
       <w:proofErr w:type="spellEnd"/>
       <w:r>
+        <w:rPr>
+          <w:rFonts w:ascii="Times New Roman" w:hAnsi="Times New Roman" w:cs="Times New Roman"/>
+          <w:sz w:val="26"/>
+          <w:szCs w:val="26"/>
+        </w:rPr>
         <w:t>: Phạm Công Nguyên</w:t>
       </w:r>
     </w:p>
     <w:p>
+      <w:pPr>
+        <w:rPr>
+          <w:rFonts w:ascii="Times New Roman" w:hAnsi="Times New Roman" w:cs="Times New Roman"/>
+          <w:sz w:val="26"/>
+          <w:szCs w:val="26"/>
+        </w:rPr>
+      </w:pPr>
       <w:proofErr w:type="spellStart"/>
       <w:r>
+        <w:rPr>
+          <w:rFonts w:ascii="Times New Roman" w:hAnsi="Times New Roman" w:cs="Times New Roman"/>
+          <w:sz w:val="26"/>
+          <w:szCs w:val="26"/>
+        </w:rPr>
         <w:t>Lớp</w:t>
       </w:r>
       <w:proofErr w:type="spellEnd"/>
       <w:r>
+        <w:rPr>
+          <w:rFonts w:ascii="Times New Roman" w:hAnsi="Times New Roman" w:cs="Times New Roman"/>
+          <w:sz w:val="26"/>
+          <w:szCs w:val="26"/>
+        </w:rPr>
         <w:t>: 11_ĐH_THMT</w:t>
       </w:r>
     </w:p>
     <w:p>
-      <w:r>
+      <w:pPr>
+        <w:rPr>
+          <w:rFonts w:ascii="Times New Roman" w:hAnsi="Times New Roman" w:cs="Times New Roman"/>
+          <w:sz w:val="26"/>
+          <w:szCs w:val="26"/>
+        </w:rPr>
+      </w:pPr>
+      <w:r>
+        <w:rPr>
+          <w:rFonts w:ascii="Times New Roman" w:hAnsi="Times New Roman" w:cs="Times New Roman"/>
+          <w:sz w:val="26"/>
+          <w:szCs w:val="26"/>
+        </w:rPr>
         <w:t xml:space="preserve">MSSV: 1150080027 </w:t>
       </w:r>
     </w:p>
-    <w:p/>
     <w:p>
-      <w:r>
-        <w:t>https://youtu.be/gVrbZOJbcHU</w:t>
-      </w:r>
+      <w:pPr>
+        <w:rPr>
+          <w:rFonts w:ascii="Times New Roman" w:hAnsi="Times New Roman" w:cs="Times New Roman"/>
+          <w:sz w:val="26"/>
+          <w:szCs w:val="26"/>
+        </w:rPr>
+      </w:pPr>
     </w:p>
-    <w:p/>
     <w:p>
-      <w:r>
-        <w:rPr>
+      <w:pPr>
+        <w:rPr>
+          <w:rFonts w:ascii="Times New Roman" w:hAnsi="Times New Roman" w:cs="Times New Roman"/>
+          <w:sz w:val="26"/>
+          <w:szCs w:val="26"/>
+        </w:rPr>
+      </w:pPr>
+      <w:hyperlink r:id="rId4" w:history="1">
+        <w:r>
+          <w:rPr>
+            <w:rStyle w:val="Hyperlink"/>
+            <w:rFonts w:ascii="Times New Roman" w:hAnsi="Times New Roman" w:cs="Times New Roman"/>
+            <w:sz w:val="26"/>
+            <w:szCs w:val="26"/>
+          </w:rPr>
+          <w:t>https://www.youtube.com/watch?v=gVrbZOJbcHU</w:t>
+        </w:r>
+      </w:hyperlink>
+    </w:p>
+    <w:p>
+      <w:pPr>
+        <w:rPr>
+          <w:rFonts w:ascii="Times New Roman" w:hAnsi="Times New Roman" w:cs="Times New Roman"/>
+          <w:sz w:val="26"/>
+          <w:szCs w:val="26"/>
+        </w:rPr>
+      </w:pPr>
+      <w:hyperlink r:id="rId5" w:history="1">
+        <w:r>
+          <w:rPr>
+            <w:rStyle w:val="Hyperlink"/>
+            <w:rFonts w:ascii="Times New Roman" w:hAnsi="Times New Roman" w:cs="Times New Roman"/>
+            <w:sz w:val="26"/>
+            <w:szCs w:val="26"/>
+          </w:rPr>
+          <w:t>LAB5 ATHTTT</w:t>
+        </w:r>
+      </w:hyperlink>
+      <w:r>
+        <w:rPr>
+          <w:rFonts w:ascii="Times New Roman" w:hAnsi="Times New Roman" w:cs="Times New Roman"/>
           <w:noProof/>
-        </w:rPr>
-        <w:lastRenderedPageBreak/>
+          <w:sz w:val="26"/>
+          <w:szCs w:val="26"/>
+        </w:rPr>
         <w:drawing>
           <wp:inline distT="0" distB="0" distL="0" distR="0" wp14:anchorId="7A0F3FC9" wp14:editId="3AD6C02D">
             <wp:extent cx="5943600" cy="3726180"/>
@@ -56,7 +144,7 @@
                     <pic:cNvPicPr/>
                   </pic:nvPicPr>
                   <pic:blipFill>
-                    <a:blip r:embed="rId4"/>
+                    <a:blip r:embed="rId6"/>
                     <a:stretch>
                       <a:fillRect/>
                     </a:stretch>
@@ -78,8 +166,12 @@
       </w:r>
       <w:r>
         <w:rPr>
+          <w:rFonts w:ascii="Times New Roman" w:hAnsi="Times New Roman" w:cs="Times New Roman"/>
           <w:noProof/>
-        </w:rPr>
+          <w:sz w:val="26"/>
+          <w:szCs w:val="26"/>
+        </w:rPr>
+        <w:lastRenderedPageBreak/>
         <w:drawing>
           <wp:inline distT="0" distB="0" distL="0" distR="0" wp14:anchorId="061F6650" wp14:editId="4C89CADF">
             <wp:extent cx="5943600" cy="3601085"/>
@@ -96,7 +188,7 @@
                     <pic:cNvPicPr/>
                   </pic:nvPicPr>
                   <pic:blipFill>
-                    <a:blip r:embed="rId5"/>
+                    <a:blip r:embed="rId7"/>
                     <a:stretch>
                       <a:fillRect/>
                     </a:stretch>
@@ -118,9 +210,11 @@
       </w:r>
       <w:r>
         <w:rPr>
+          <w:rFonts w:ascii="Times New Roman" w:hAnsi="Times New Roman" w:cs="Times New Roman"/>
           <w:noProof/>
-        </w:rPr>
-        <w:lastRenderedPageBreak/>
+          <w:sz w:val="26"/>
+          <w:szCs w:val="26"/>
+        </w:rPr>
         <w:drawing>
           <wp:inline distT="0" distB="0" distL="0" distR="0" wp14:anchorId="3037C7B9" wp14:editId="4F4CA467">
             <wp:extent cx="5943600" cy="3376930"/>
@@ -137,7 +231,7 @@
                     <pic:cNvPicPr/>
                   </pic:nvPicPr>
                   <pic:blipFill>
-                    <a:blip r:embed="rId6"/>
+                    <a:blip r:embed="rId8"/>
                     <a:stretch>
                       <a:fillRect/>
                     </a:stretch>
@@ -159,8 +253,12 @@
       </w:r>
       <w:r>
         <w:rPr>
+          <w:rFonts w:ascii="Times New Roman" w:hAnsi="Times New Roman" w:cs="Times New Roman"/>
           <w:noProof/>
-        </w:rPr>
+          <w:sz w:val="26"/>
+          <w:szCs w:val="26"/>
+        </w:rPr>
+        <w:lastRenderedPageBreak/>
         <w:drawing>
           <wp:inline distT="0" distB="0" distL="0" distR="0" wp14:anchorId="72C92810" wp14:editId="562C9934">
             <wp:extent cx="5943600" cy="3703955"/>
@@ -177,7 +275,7 @@
                     <pic:cNvPicPr/>
                   </pic:nvPicPr>
                   <pic:blipFill>
-                    <a:blip r:embed="rId7"/>
+                    <a:blip r:embed="rId9"/>
                     <a:stretch>
                       <a:fillRect/>
                     </a:stretch>
@@ -186,6 +284,537 @@
                     <a:xfrm>
                       <a:off x="0" y="0"/>
                       <a:ext cx="5943600" cy="3703955"/>
+                    </a:xfrm>
+                    <a:prstGeom prst="rect">
+                      <a:avLst/>
+                    </a:prstGeom>
+                  </pic:spPr>
+                </pic:pic>
+              </a:graphicData>
+            </a:graphic>
+          </wp:inline>
+        </w:drawing>
+      </w:r>
+    </w:p>
+    <w:p>
+      <w:pPr>
+        <w:rPr>
+          <w:rFonts w:ascii="Times New Roman" w:hAnsi="Times New Roman" w:cs="Times New Roman"/>
+          <w:sz w:val="26"/>
+          <w:szCs w:val="26"/>
+        </w:rPr>
+      </w:pPr>
+      <w:r>
+        <w:rPr>
+          <w:rFonts w:ascii="Times New Roman" w:hAnsi="Times New Roman" w:cs="Times New Roman"/>
+          <w:sz w:val="26"/>
+          <w:szCs w:val="26"/>
+        </w:rPr>
+        <w:t xml:space="preserve">Trường </w:t>
+      </w:r>
+      <w:proofErr w:type="spellStart"/>
+      <w:r>
+        <w:rPr>
+          <w:rFonts w:ascii="Times New Roman" w:hAnsi="Times New Roman" w:cs="Times New Roman"/>
+          <w:sz w:val="26"/>
+          <w:szCs w:val="26"/>
+        </w:rPr>
+        <w:t>hợp</w:t>
+      </w:r>
+      <w:proofErr w:type="spellEnd"/>
+      <w:r>
+        <w:rPr>
+          <w:rFonts w:ascii="Times New Roman" w:hAnsi="Times New Roman" w:cs="Times New Roman"/>
+          <w:sz w:val="26"/>
+          <w:szCs w:val="26"/>
+        </w:rPr>
+        <w:t xml:space="preserve"> 1:</w:t>
+      </w:r>
+    </w:p>
+    <w:p>
+      <w:pPr>
+        <w:rPr>
+          <w:rFonts w:ascii="Times New Roman" w:hAnsi="Times New Roman" w:cs="Times New Roman"/>
+          <w:sz w:val="26"/>
+          <w:szCs w:val="26"/>
+        </w:rPr>
+      </w:pPr>
+      <w:r>
+        <w:rPr>
+          <w:rFonts w:ascii="Times New Roman" w:hAnsi="Times New Roman" w:cs="Times New Roman"/>
+          <w:noProof/>
+          <w:sz w:val="26"/>
+          <w:szCs w:val="26"/>
+        </w:rPr>
+        <w:lastRenderedPageBreak/>
+        <w:drawing>
+          <wp:inline distT="0" distB="0" distL="0" distR="0" wp14:anchorId="52E0B36E" wp14:editId="0DA95191">
+            <wp:extent cx="5943600" cy="3676650"/>
+            <wp:effectExtent l="0" t="0" r="0" b="0"/>
+            <wp:docPr id="1642776099" name="Picture 1"/>
+            <wp:cNvGraphicFramePr>
+              <a:graphicFrameLocks xmlns:a="http://schemas.openxmlformats.org/drawingml/2006/main" noChangeAspect="1"/>
+            </wp:cNvGraphicFramePr>
+            <a:graphic xmlns:a="http://schemas.openxmlformats.org/drawingml/2006/main">
+              <a:graphicData uri="http://schemas.openxmlformats.org/drawingml/2006/picture">
+                <pic:pic xmlns:pic="http://schemas.openxmlformats.org/drawingml/2006/picture">
+                  <pic:nvPicPr>
+                    <pic:cNvPr id="1642776099" name=""/>
+                    <pic:cNvPicPr/>
+                  </pic:nvPicPr>
+                  <pic:blipFill>
+                    <a:blip r:embed="rId10"/>
+                    <a:stretch>
+                      <a:fillRect/>
+                    </a:stretch>
+                  </pic:blipFill>
+                  <pic:spPr>
+                    <a:xfrm>
+                      <a:off x="0" y="0"/>
+                      <a:ext cx="5943600" cy="3676650"/>
+                    </a:xfrm>
+                    <a:prstGeom prst="rect">
+                      <a:avLst/>
+                    </a:prstGeom>
+                  </pic:spPr>
+                </pic:pic>
+              </a:graphicData>
+            </a:graphic>
+          </wp:inline>
+        </w:drawing>
+      </w:r>
+      <w:r>
+        <w:rPr>
+          <w:rFonts w:ascii="Times New Roman" w:hAnsi="Times New Roman" w:cs="Times New Roman"/>
+          <w:noProof/>
+          <w:sz w:val="26"/>
+          <w:szCs w:val="26"/>
+        </w:rPr>
+        <w:drawing>
+          <wp:inline distT="0" distB="0" distL="0" distR="0" wp14:anchorId="395B5A5A" wp14:editId="2B9951C7">
+            <wp:extent cx="5943600" cy="3379470"/>
+            <wp:effectExtent l="0" t="0" r="0" b="0"/>
+            <wp:docPr id="795063708" name="Picture 1"/>
+            <wp:cNvGraphicFramePr>
+              <a:graphicFrameLocks xmlns:a="http://schemas.openxmlformats.org/drawingml/2006/main" noChangeAspect="1"/>
+            </wp:cNvGraphicFramePr>
+            <a:graphic xmlns:a="http://schemas.openxmlformats.org/drawingml/2006/main">
+              <a:graphicData uri="http://schemas.openxmlformats.org/drawingml/2006/picture">
+                <pic:pic xmlns:pic="http://schemas.openxmlformats.org/drawingml/2006/picture">
+                  <pic:nvPicPr>
+                    <pic:cNvPr id="795063708" name=""/>
+                    <pic:cNvPicPr/>
+                  </pic:nvPicPr>
+                  <pic:blipFill>
+                    <a:blip r:embed="rId11"/>
+                    <a:stretch>
+                      <a:fillRect/>
+                    </a:stretch>
+                  </pic:blipFill>
+                  <pic:spPr>
+                    <a:xfrm>
+                      <a:off x="0" y="0"/>
+                      <a:ext cx="5943600" cy="3379470"/>
+                    </a:xfrm>
+                    <a:prstGeom prst="rect">
+                      <a:avLst/>
+                    </a:prstGeom>
+                  </pic:spPr>
+                </pic:pic>
+              </a:graphicData>
+            </a:graphic>
+          </wp:inline>
+        </w:drawing>
+      </w:r>
+      <w:r>
+        <w:rPr>
+          <w:rFonts w:ascii="Times New Roman" w:hAnsi="Times New Roman" w:cs="Times New Roman"/>
+          <w:sz w:val="26"/>
+          <w:szCs w:val="26"/>
+        </w:rPr>
+        <w:lastRenderedPageBreak/>
+        <w:drawing>
+          <wp:inline distT="0" distB="0" distL="0" distR="0" wp14:anchorId="429FFAD3" wp14:editId="13B743FA">
+            <wp:extent cx="5943600" cy="3699510"/>
+            <wp:effectExtent l="0" t="0" r="0" b="0"/>
+            <wp:docPr id="1158982196" name="Picture 1"/>
+            <wp:cNvGraphicFramePr>
+              <a:graphicFrameLocks xmlns:a="http://schemas.openxmlformats.org/drawingml/2006/main" noChangeAspect="1"/>
+            </wp:cNvGraphicFramePr>
+            <a:graphic xmlns:a="http://schemas.openxmlformats.org/drawingml/2006/main">
+              <a:graphicData uri="http://schemas.openxmlformats.org/drawingml/2006/picture">
+                <pic:pic xmlns:pic="http://schemas.openxmlformats.org/drawingml/2006/picture">
+                  <pic:nvPicPr>
+                    <pic:cNvPr id="1158982196" name=""/>
+                    <pic:cNvPicPr/>
+                  </pic:nvPicPr>
+                  <pic:blipFill>
+                    <a:blip r:embed="rId12"/>
+                    <a:stretch>
+                      <a:fillRect/>
+                    </a:stretch>
+                  </pic:blipFill>
+                  <pic:spPr>
+                    <a:xfrm>
+                      <a:off x="0" y="0"/>
+                      <a:ext cx="5943600" cy="3699510"/>
+                    </a:xfrm>
+                    <a:prstGeom prst="rect">
+                      <a:avLst/>
+                    </a:prstGeom>
+                  </pic:spPr>
+                </pic:pic>
+              </a:graphicData>
+            </a:graphic>
+          </wp:inline>
+        </w:drawing>
+      </w:r>
+    </w:p>
+    <w:p>
+      <w:pPr>
+        <w:rPr>
+          <w:rFonts w:ascii="Times New Roman" w:hAnsi="Times New Roman" w:cs="Times New Roman"/>
+          <w:sz w:val="26"/>
+          <w:szCs w:val="26"/>
+        </w:rPr>
+      </w:pPr>
+      <w:proofErr w:type="spellStart"/>
+      <w:r>
+        <w:rPr>
+          <w:rFonts w:ascii="Times New Roman" w:hAnsi="Times New Roman" w:cs="Times New Roman"/>
+          <w:sz w:val="26"/>
+          <w:szCs w:val="26"/>
+        </w:rPr>
+        <w:t>Tình</w:t>
+      </w:r>
+      <w:proofErr w:type="spellEnd"/>
+      <w:r>
+        <w:rPr>
+          <w:rFonts w:ascii="Times New Roman" w:hAnsi="Times New Roman" w:cs="Times New Roman"/>
+          <w:sz w:val="26"/>
+          <w:szCs w:val="26"/>
+        </w:rPr>
+        <w:t xml:space="preserve"> </w:t>
+      </w:r>
+      <w:proofErr w:type="spellStart"/>
+      <w:r>
+        <w:rPr>
+          <w:rFonts w:ascii="Times New Roman" w:hAnsi="Times New Roman" w:cs="Times New Roman"/>
+          <w:sz w:val="26"/>
+          <w:szCs w:val="26"/>
+        </w:rPr>
+        <w:t>huống</w:t>
+      </w:r>
+      <w:proofErr w:type="spellEnd"/>
+      <w:r>
+        <w:rPr>
+          <w:rFonts w:ascii="Times New Roman" w:hAnsi="Times New Roman" w:cs="Times New Roman"/>
+          <w:sz w:val="26"/>
+          <w:szCs w:val="26"/>
+        </w:rPr>
+        <w:t xml:space="preserve"> 2:</w:t>
+      </w:r>
+    </w:p>
+    <w:p>
+      <w:pPr>
+        <w:rPr>
+          <w:rFonts w:ascii="Times New Roman" w:hAnsi="Times New Roman" w:cs="Times New Roman"/>
+          <w:sz w:val="26"/>
+          <w:szCs w:val="26"/>
+        </w:rPr>
+      </w:pPr>
+      <w:r>
+        <w:rPr>
+          <w:rFonts w:ascii="Times New Roman" w:hAnsi="Times New Roman" w:cs="Times New Roman"/>
+          <w:sz w:val="26"/>
+          <w:szCs w:val="26"/>
+        </w:rPr>
+        <w:lastRenderedPageBreak/>
+        <w:drawing>
+          <wp:inline distT="0" distB="0" distL="0" distR="0" wp14:anchorId="0E3574B1" wp14:editId="231CD813">
+            <wp:extent cx="5943600" cy="4529455"/>
+            <wp:effectExtent l="0" t="0" r="0" b="4445"/>
+            <wp:docPr id="977978178" name="Picture 1"/>
+            <wp:cNvGraphicFramePr>
+              <a:graphicFrameLocks xmlns:a="http://schemas.openxmlformats.org/drawingml/2006/main" noChangeAspect="1"/>
+            </wp:cNvGraphicFramePr>
+            <a:graphic xmlns:a="http://schemas.openxmlformats.org/drawingml/2006/main">
+              <a:graphicData uri="http://schemas.openxmlformats.org/drawingml/2006/picture">
+                <pic:pic xmlns:pic="http://schemas.openxmlformats.org/drawingml/2006/picture">
+                  <pic:nvPicPr>
+                    <pic:cNvPr id="977978178" name=""/>
+                    <pic:cNvPicPr/>
+                  </pic:nvPicPr>
+                  <pic:blipFill>
+                    <a:blip r:embed="rId13"/>
+                    <a:stretch>
+                      <a:fillRect/>
+                    </a:stretch>
+                  </pic:blipFill>
+                  <pic:spPr>
+                    <a:xfrm>
+                      <a:off x="0" y="0"/>
+                      <a:ext cx="5943600" cy="4529455"/>
+                    </a:xfrm>
+                    <a:prstGeom prst="rect">
+                      <a:avLst/>
+                    </a:prstGeom>
+                  </pic:spPr>
+                </pic:pic>
+              </a:graphicData>
+            </a:graphic>
+          </wp:inline>
+        </w:drawing>
+      </w:r>
+      <w:r>
+        <w:rPr>
+          <w:rFonts w:ascii="Times New Roman" w:hAnsi="Times New Roman" w:cs="Times New Roman"/>
+          <w:sz w:val="26"/>
+          <w:szCs w:val="26"/>
+        </w:rPr>
+        <w:lastRenderedPageBreak/>
+        <w:drawing>
+          <wp:inline distT="0" distB="0" distL="0" distR="0" wp14:anchorId="117F515C" wp14:editId="19BA7CB5">
+            <wp:extent cx="5943600" cy="4382770"/>
+            <wp:effectExtent l="0" t="0" r="0" b="0"/>
+            <wp:docPr id="2061387191" name="Picture 1"/>
+            <wp:cNvGraphicFramePr>
+              <a:graphicFrameLocks xmlns:a="http://schemas.openxmlformats.org/drawingml/2006/main" noChangeAspect="1"/>
+            </wp:cNvGraphicFramePr>
+            <a:graphic xmlns:a="http://schemas.openxmlformats.org/drawingml/2006/main">
+              <a:graphicData uri="http://schemas.openxmlformats.org/drawingml/2006/picture">
+                <pic:pic xmlns:pic="http://schemas.openxmlformats.org/drawingml/2006/picture">
+                  <pic:nvPicPr>
+                    <pic:cNvPr id="2061387191" name=""/>
+                    <pic:cNvPicPr/>
+                  </pic:nvPicPr>
+                  <pic:blipFill>
+                    <a:blip r:embed="rId14"/>
+                    <a:stretch>
+                      <a:fillRect/>
+                    </a:stretch>
+                  </pic:blipFill>
+                  <pic:spPr>
+                    <a:xfrm>
+                      <a:off x="0" y="0"/>
+                      <a:ext cx="5943600" cy="4382770"/>
+                    </a:xfrm>
+                    <a:prstGeom prst="rect">
+                      <a:avLst/>
+                    </a:prstGeom>
+                  </pic:spPr>
+                </pic:pic>
+              </a:graphicData>
+            </a:graphic>
+          </wp:inline>
+        </w:drawing>
+      </w:r>
+      <w:r>
+        <w:rPr>
+          <w:rFonts w:ascii="Times New Roman" w:hAnsi="Times New Roman" w:cs="Times New Roman"/>
+          <w:noProof/>
+          <w:sz w:val="26"/>
+          <w:szCs w:val="26"/>
+        </w:rPr>
+        <w:drawing>
+          <wp:inline distT="0" distB="0" distL="0" distR="0" wp14:anchorId="50192FF2" wp14:editId="382F9B99">
+            <wp:extent cx="5943600" cy="2611755"/>
+            <wp:effectExtent l="0" t="0" r="0" b="0"/>
+            <wp:docPr id="1643237864" name="Picture 1"/>
+            <wp:cNvGraphicFramePr>
+              <a:graphicFrameLocks xmlns:a="http://schemas.openxmlformats.org/drawingml/2006/main" noChangeAspect="1"/>
+            </wp:cNvGraphicFramePr>
+            <a:graphic xmlns:a="http://schemas.openxmlformats.org/drawingml/2006/main">
+              <a:graphicData uri="http://schemas.openxmlformats.org/drawingml/2006/picture">
+                <pic:pic xmlns:pic="http://schemas.openxmlformats.org/drawingml/2006/picture">
+                  <pic:nvPicPr>
+                    <pic:cNvPr id="1643237864" name=""/>
+                    <pic:cNvPicPr/>
+                  </pic:nvPicPr>
+                  <pic:blipFill>
+                    <a:blip r:embed="rId15"/>
+                    <a:stretch>
+                      <a:fillRect/>
+                    </a:stretch>
+                  </pic:blipFill>
+                  <pic:spPr>
+                    <a:xfrm>
+                      <a:off x="0" y="0"/>
+                      <a:ext cx="5943600" cy="2611755"/>
+                    </a:xfrm>
+                    <a:prstGeom prst="rect">
+                      <a:avLst/>
+                    </a:prstGeom>
+                  </pic:spPr>
+                </pic:pic>
+              </a:graphicData>
+            </a:graphic>
+          </wp:inline>
+        </w:drawing>
+      </w:r>
+      <w:r>
+        <w:rPr>
+          <w:rFonts w:ascii="Times New Roman" w:hAnsi="Times New Roman" w:cs="Times New Roman"/>
+          <w:noProof/>
+          <w:sz w:val="26"/>
+          <w:szCs w:val="26"/>
+        </w:rPr>
+        <w:lastRenderedPageBreak/>
+        <w:drawing>
+          <wp:inline distT="0" distB="0" distL="0" distR="0" wp14:anchorId="6AC80076" wp14:editId="4A27605B">
+            <wp:extent cx="5943600" cy="2800350"/>
+            <wp:effectExtent l="0" t="0" r="0" b="0"/>
+            <wp:docPr id="829660740" name="Picture 1"/>
+            <wp:cNvGraphicFramePr>
+              <a:graphicFrameLocks xmlns:a="http://schemas.openxmlformats.org/drawingml/2006/main" noChangeAspect="1"/>
+            </wp:cNvGraphicFramePr>
+            <a:graphic xmlns:a="http://schemas.openxmlformats.org/drawingml/2006/main">
+              <a:graphicData uri="http://schemas.openxmlformats.org/drawingml/2006/picture">
+                <pic:pic xmlns:pic="http://schemas.openxmlformats.org/drawingml/2006/picture">
+                  <pic:nvPicPr>
+                    <pic:cNvPr id="829660740" name=""/>
+                    <pic:cNvPicPr/>
+                  </pic:nvPicPr>
+                  <pic:blipFill>
+                    <a:blip r:embed="rId16"/>
+                    <a:stretch>
+                      <a:fillRect/>
+                    </a:stretch>
+                  </pic:blipFill>
+                  <pic:spPr>
+                    <a:xfrm>
+                      <a:off x="0" y="0"/>
+                      <a:ext cx="5943600" cy="2800350"/>
+                    </a:xfrm>
+                    <a:prstGeom prst="rect">
+                      <a:avLst/>
+                    </a:prstGeom>
+                  </pic:spPr>
+                </pic:pic>
+              </a:graphicData>
+            </a:graphic>
+          </wp:inline>
+        </w:drawing>
+      </w:r>
+    </w:p>
+    <w:p>
+      <w:pPr>
+        <w:rPr>
+          <w:rFonts w:ascii="Times New Roman" w:hAnsi="Times New Roman" w:cs="Times New Roman"/>
+          <w:sz w:val="26"/>
+          <w:szCs w:val="26"/>
+        </w:rPr>
+      </w:pPr>
+      <w:r>
+        <w:rPr>
+          <w:rFonts w:ascii="Times New Roman" w:hAnsi="Times New Roman" w:cs="Times New Roman"/>
+          <w:sz w:val="26"/>
+          <w:szCs w:val="26"/>
+        </w:rPr>
+        <w:t xml:space="preserve">Trường </w:t>
+      </w:r>
+      <w:proofErr w:type="spellStart"/>
+      <w:r>
+        <w:rPr>
+          <w:rFonts w:ascii="Times New Roman" w:hAnsi="Times New Roman" w:cs="Times New Roman"/>
+          <w:sz w:val="26"/>
+          <w:szCs w:val="26"/>
+        </w:rPr>
+        <w:t>hợp</w:t>
+      </w:r>
+      <w:proofErr w:type="spellEnd"/>
+      <w:r>
+        <w:rPr>
+          <w:rFonts w:ascii="Times New Roman" w:hAnsi="Times New Roman" w:cs="Times New Roman"/>
+          <w:sz w:val="26"/>
+          <w:szCs w:val="26"/>
+        </w:rPr>
+        <w:t xml:space="preserve"> 3:</w:t>
+      </w:r>
+    </w:p>
+    <w:p>
+      <w:pPr>
+        <w:rPr>
+          <w:rFonts w:ascii="Times New Roman" w:hAnsi="Times New Roman" w:cs="Times New Roman"/>
+          <w:sz w:val="26"/>
+          <w:szCs w:val="26"/>
+        </w:rPr>
+      </w:pPr>
+      <w:r>
+        <w:rPr>
+          <w:rFonts w:ascii="Times New Roman" w:hAnsi="Times New Roman" w:cs="Times New Roman"/>
+          <w:noProof/>
+          <w:sz w:val="26"/>
+          <w:szCs w:val="26"/>
+        </w:rPr>
+        <w:lastRenderedPageBreak/>
+        <w:drawing>
+          <wp:inline distT="0" distB="0" distL="0" distR="0" wp14:anchorId="6A86B152" wp14:editId="65AB87D9">
+            <wp:extent cx="5943600" cy="2178685"/>
+            <wp:effectExtent l="0" t="0" r="0" b="0"/>
+            <wp:docPr id="143463193" name="Picture 1"/>
+            <wp:cNvGraphicFramePr>
+              <a:graphicFrameLocks xmlns:a="http://schemas.openxmlformats.org/drawingml/2006/main" noChangeAspect="1"/>
+            </wp:cNvGraphicFramePr>
+            <a:graphic xmlns:a="http://schemas.openxmlformats.org/drawingml/2006/main">
+              <a:graphicData uri="http://schemas.openxmlformats.org/drawingml/2006/picture">
+                <pic:pic xmlns:pic="http://schemas.openxmlformats.org/drawingml/2006/picture">
+                  <pic:nvPicPr>
+                    <pic:cNvPr id="143463193" name=""/>
+                    <pic:cNvPicPr/>
+                  </pic:nvPicPr>
+                  <pic:blipFill>
+                    <a:blip r:embed="rId17"/>
+                    <a:stretch>
+                      <a:fillRect/>
+                    </a:stretch>
+                  </pic:blipFill>
+                  <pic:spPr>
+                    <a:xfrm>
+                      <a:off x="0" y="0"/>
+                      <a:ext cx="5943600" cy="2178685"/>
+                    </a:xfrm>
+                    <a:prstGeom prst="rect">
+                      <a:avLst/>
+                    </a:prstGeom>
+                  </pic:spPr>
+                </pic:pic>
+              </a:graphicData>
+            </a:graphic>
+          </wp:inline>
+        </w:drawing>
+      </w:r>
+      <w:r>
+        <w:rPr>
+          <w:rFonts w:ascii="Times New Roman" w:hAnsi="Times New Roman" w:cs="Times New Roman"/>
+          <w:sz w:val="26"/>
+          <w:szCs w:val="26"/>
+        </w:rPr>
+        <w:drawing>
+          <wp:inline distT="0" distB="0" distL="0" distR="0" wp14:anchorId="0C51E1F6" wp14:editId="25E3F10F">
+            <wp:extent cx="5875020" cy="2872740"/>
+            <wp:effectExtent l="0" t="0" r="0" b="3810"/>
+            <wp:docPr id="1252352723" name="Picture 1"/>
+            <wp:cNvGraphicFramePr>
+              <a:graphicFrameLocks xmlns:a="http://schemas.openxmlformats.org/drawingml/2006/main" noChangeAspect="1"/>
+            </wp:cNvGraphicFramePr>
+            <a:graphic xmlns:a="http://schemas.openxmlformats.org/drawingml/2006/main">
+              <a:graphicData uri="http://schemas.openxmlformats.org/drawingml/2006/picture">
+                <pic:pic xmlns:pic="http://schemas.openxmlformats.org/drawingml/2006/picture">
+                  <pic:nvPicPr>
+                    <pic:cNvPr id="1252352723" name=""/>
+                    <pic:cNvPicPr/>
+                  </pic:nvPicPr>
+                  <pic:blipFill>
+                    <a:blip r:embed="rId18"/>
+                    <a:stretch>
+                      <a:fillRect/>
+                    </a:stretch>
+                  </pic:blipFill>
+                  <pic:spPr>
+                    <a:xfrm>
+                      <a:off x="0" y="0"/>
+                      <a:ext cx="5875531" cy="2872990"/>
                     </a:xfrm>
                     <a:prstGeom prst="rect">
                       <a:avLst/>
@@ -811,7 +1440,6 @@
   <w:style w:type="character" w:default="1" w:styleId="DefaultParagraphFont">
     <w:name w:val="Default Paragraph Font"/>
     <w:uiPriority w:val="1"/>
-    <w:semiHidden/>
     <w:unhideWhenUsed/>
   </w:style>
   <w:style w:type="table" w:default="1" w:styleId="TableNormal">
@@ -1123,6 +1751,41 @@
       <w:smallCaps/>
       <w:color w:val="2F5496" w:themeColor="accent1" w:themeShade="BF"/>
       <w:spacing w:val="5"/>
+    </w:rPr>
+  </w:style>
+  <w:style w:type="character" w:styleId="Hyperlink">
+    <w:name w:val="Hyperlink"/>
+    <w:basedOn w:val="DefaultParagraphFont"/>
+    <w:uiPriority w:val="99"/>
+    <w:unhideWhenUsed/>
+    <w:rsid w:val="00DA00B7"/>
+    <w:rPr>
+      <w:color w:val="0563C1" w:themeColor="hyperlink"/>
+      <w:u w:val="single"/>
+    </w:rPr>
+  </w:style>
+  <w:style w:type="character" w:styleId="UnresolvedMention">
+    <w:name w:val="Unresolved Mention"/>
+    <w:basedOn w:val="DefaultParagraphFont"/>
+    <w:uiPriority w:val="99"/>
+    <w:semiHidden/>
+    <w:unhideWhenUsed/>
+    <w:rsid w:val="00DA00B7"/>
+    <w:rPr>
+      <w:color w:val="605E5C"/>
+      <w:shd w:val="clear" w:color="auto" w:fill="E1DFDD"/>
+    </w:rPr>
+  </w:style>
+  <w:style w:type="character" w:styleId="FollowedHyperlink">
+    <w:name w:val="FollowedHyperlink"/>
+    <w:basedOn w:val="DefaultParagraphFont"/>
+    <w:uiPriority w:val="99"/>
+    <w:semiHidden/>
+    <w:unhideWhenUsed/>
+    <w:rsid w:val="00DA00B7"/>
+    <w:rPr>
+      <w:color w:val="954F72" w:themeColor="followedHyperlink"/>
+      <w:u w:val="single"/>
     </w:rPr>
   </w:style>
 </w:styles>

</xml_diff>